<commit_message>
Add mobile field to KAI draft
</commit_message>
<xml_diff>
--- a/static/templates/HER_KAI.docx
+++ b/static/templates/HER_KAI.docx
@@ -585,7 +585,7 @@
                 <w:b/>
                 <w:sz w:val="20"/>
               </w:rPr>
-              <w:t>ΒΑΘΜΟΣ</w:t>
+              <w:t>ΒΑΘΜΟΣ/ΕΙΔ</w:t>
             </w:r>
             <w:r>
               <w:tab/>
@@ -636,7 +636,11 @@
           <w:p>
             <w:pPr>
               <w:widowControl w:val="0"/>
-              <w:spacing w:after="0" w:line="240" w:lineRule="auto"/>
+              <w:tabs>
+                <w:tab w:pos="3742" w:val="left"/>
+              </w:tabs>
+              <w:spacing w:after="0" w:line="240" w:lineRule="auto"/>
+              <w:jc w:val="left"/>
               <w:rPr>
                 <w:rFonts w:ascii="Arial" w:hAnsi="Arial" w:cs="Arial"/>
                 <w:b/>
@@ -647,13 +651,22 @@
             </w:pPr>
             <w:r>
               <w:rPr>
-                <w:rFonts w:ascii="Arial" w:eastAsia="Aptos" w:hAnsi="Arial" w:cs="Arial"/>
+                <w:rFonts w:ascii="Arial" w:hAnsi="Arial" w:eastAsia="Arial"/>
                 <w:b/>
-                <w:bCs/>
-                <w:sz w:val="20"/>
-                <w:szCs w:val="20"/>
-              </w:rPr>
-              <w:t>ΕΙΔΙΚΟΤΗΤΑ</w:t>
+                <w:sz w:val="20"/>
+              </w:rPr>
+              <w:t>ΜΟΝΑΔΑ</w:t>
+            </w:r>
+            <w:r>
+              <w:tab/>
+            </w:r>
+            <w:r>
+              <w:rPr>
+                <w:rFonts w:ascii="Arial" w:hAnsi="Arial" w:eastAsia="Arial"/>
+                <w:b w:val="0"/>
+                <w:sz w:val="18"/>
+              </w:rPr>
+              <w:t>{{ MONADA }}</w:t>
             </w:r>
           </w:p>
         </w:tc>
@@ -708,7 +721,7 @@
                 <w:b/>
                 <w:sz w:val="20"/>
               </w:rPr>
-              <w:t>ΜΟΝΑΔΑ</w:t>
+              <w:t>ΑΜΚΑ</w:t>
             </w:r>
             <w:r>
               <w:tab/>
@@ -719,7 +732,7 @@
                 <w:b w:val="0"/>
                 <w:sz w:val="18"/>
               </w:rPr>
-              <w:t>{{ MONADA }}</w:t>
+              <w:t>{{ AMKA }}</w:t>
             </w:r>
           </w:p>
         </w:tc>
@@ -795,7 +808,7 @@
                 <w:b/>
                 <w:sz w:val="20"/>
               </w:rPr>
-              <w:t>ΑΜΚΑ</w:t>
+              <w:t>ΗΜ. ΓΕΝΝΗΣΗΣ</w:t>
             </w:r>
             <w:r>
               <w:tab/>
@@ -806,7 +819,7 @@
                 <w:b w:val="0"/>
                 <w:sz w:val="18"/>
               </w:rPr>
-              <w:t>{{ AMKA }}</w:t>
+              <w:t>{{ HM_GEN }}</w:t>
             </w:r>
           </w:p>
         </w:tc>
@@ -854,7 +867,7 @@
                 <w:b/>
                 <w:sz w:val="20"/>
               </w:rPr>
-              <w:t>ΗΜ. ΓΕΝΝΗΣΗΣ</w:t>
+              <w:t>ΤΗΛ.ΚΙΝΗΤΟ</w:t>
             </w:r>
             <w:r>
               <w:tab/>
@@ -865,7 +878,7 @@
                 <w:b w:val="0"/>
                 <w:sz w:val="18"/>
               </w:rPr>
-              <w:t>{{ HM_GEN }}</w:t>
+              <w:t>{{ KINITO }}</w:t>
             </w:r>
           </w:p>
         </w:tc>
@@ -899,6 +912,7 @@
             <w:pPr>
               <w:widowControl w:val="0"/>
               <w:spacing w:after="0" w:line="240" w:lineRule="auto"/>
+              <w:jc w:val="left"/>
               <w:rPr>
                 <w:rFonts w:ascii="Arial" w:hAnsi="Arial" w:cs="Arial"/>
                 <w:b/>
@@ -909,13 +923,11 @@
             </w:pPr>
             <w:r>
               <w:rPr>
-                <w:rFonts w:ascii="Arial" w:eastAsia="Aptos" w:hAnsi="Arial" w:cs="Arial"/>
+                <w:rFonts w:ascii="Arial" w:hAnsi="Arial" w:eastAsia="Arial"/>
                 <w:b/>
-                <w:bCs/>
-                <w:sz w:val="20"/>
-                <w:szCs w:val="20"/>
-              </w:rPr>
-              <w:t>ΤΗΛ.ΚΙΝΗΤΟ</w:t>
+                <w:sz w:val="17"/>
+              </w:rPr>
+              <w:t>ΣΩΜΑΤΟΜΕΤΡΙΚΑ ΣΤΟΙΧΕΙΑ:   |   ΥΨΟΣ:   |   ΒΑΡΟΣ:   |</w:t>
             </w:r>
           </w:p>
         </w:tc>

</xml_diff>